<commit_message>
feat: publish ESOL writing supports in DOCX packets
</commit_message>
<xml_diff>
--- a/lessons/1-1-flagship/downloads/1-1-flagship-notes-teacher.docx
+++ b/lessons/1-1-flagship/downloads/1-1-flagship-notes-teacher.docx
@@ -1247,7 +1247,22 @@
           <w:sz w:val="30"/>
           <w:szCs w:val="30"/>
         </w:rPr>
-        <w:t xml:space="preserve">Worked Example</w:t>
+        <w:t xml:space="preserve">Write About the Math</w:t>
+      </w:r>
+    </w:p>
+    <w:p>
+      <w:pPr>
+        <w:spacing w:after="100"/>
+      </w:pPr>
+      <w:r>
+        <w:rPr>
+          <w:i/>
+          <w:iCs/>
+          <w:color w:val="5F6F80"/>
+          <w:sz w:val="19"/>
+          <w:szCs w:val="19"/>
+        </w:rPr>
+        <w:t xml:space="preserve">Use the support level you need. Every level answers the same math question.</w:t>
       </w:r>
     </w:p>
     <w:p>
@@ -1263,17 +1278,17 @@
           <w:sz w:val="24"/>
           <w:szCs w:val="24"/>
         </w:rPr>
-        <w:t xml:space="preserve">Watch &amp; Read</w:t>
+        <w:t xml:space="preserve">1. Understand the Question</w:t>
       </w:r>
       <w:r>
         <w:rPr>
           <w:i/>
           <w:iCs/>
-          <w:color w:val="1FA6A2"/>
-          <w:sz w:val="19"/>
-          <w:szCs w:val="19"/>
-        </w:rPr>
-        <w:t xml:space="preserve">   I Do — follow along with your teacher</w:t>
+          <w:color w:val="B97A12"/>
+          <w:sz w:val="19"/>
+          <w:szCs w:val="19"/>
+        </w:rPr>
+        <w:t xml:space="preserve">   explain</w:t>
       </w:r>
     </w:p>
     <w:tbl>
@@ -1308,25 +1323,360 @@
             </w:pPr>
             <w:r>
               <w:rPr>
+                <w:color w:val="1A2733"/>
+                <w:sz w:val="21"/>
+                <w:szCs w:val="21"/>
+              </w:rPr>
+              <w:t xml:space="preserve">Look at your factor tree for 48. How did you decide which numbers to break apart first, and how did you know when to stop?</w:t>
+            </w:r>
+          </w:p>
+          <w:p>
+            <w:pPr>
+              <w:spacing w:after="0"/>
+            </w:pPr>
+            <w:r>
+              <w:rPr>
                 <w:b/>
                 <w:bCs/>
                 <w:color w:val="12355B"/>
-                <w:sz w:val="22"/>
-                <w:szCs w:val="22"/>
+                <w:sz w:val="20"/>
+                <w:szCs w:val="20"/>
               </w:rPr>
-              <w:t xml:space="preserve">Space Station Cargo Breakdown</w:t>
-            </w:r>
-          </w:p>
-          <w:p>
-            <w:pPr>
-              <w:spacing w:after="0"/>
-            </w:pPr>
+              <w:t xml:space="preserve">Your job:  </w:t>
+            </w:r>
             <w:r>
               <w:rPr>
+                <w:sz w:val="20"/>
+                <w:szCs w:val="20"/>
+              </w:rPr>
+              <w:t xml:space="preserve">Answer the question. Use math evidence. Explain how the evidence proves your answer.</w:t>
+            </w:r>
+            <w:r>
+              <w:rPr>
+                <w:i/>
+                <w:iCs/>
+                <w:color w:val="5F6F80"/>
+                <w:sz w:val="18"/>
+                <w:szCs w:val="18"/>
+              </w:rPr>
+              <w:br/>
+              <w:t xml:space="preserve">Responde la pregunta. Usa evidencia matemática. Explica cómo la evidencia demuestra tu respuesta.</w:t>
+            </w:r>
+          </w:p>
+        </w:tc>
+      </w:tr>
+    </w:tbl>
+    <w:p>
+      <w:pPr>
+        <w:pStyle w:val="Heading2"/>
+        <w:spacing w:after="80" w:before="180"/>
+      </w:pPr>
+      <w:r>
+        <w:rPr>
+          <w:b/>
+          <w:bCs/>
+          <w:color w:val="12355B"/>
+          <w:sz w:val="24"/>
+          <w:szCs w:val="24"/>
+        </w:rPr>
+        <w:t xml:space="preserve">2. Plan Your Math Words</w:t>
+      </w:r>
+      <w:r>
+        <w:rPr>
+          <w:i/>
+          <w:iCs/>
+          <w:color w:val="1FA6A2"/>
+          <w:sz w:val="19"/>
+          <w:szCs w:val="19"/>
+        </w:rPr>
+        <w:t xml:space="preserve">   check at least two</w:t>
+      </w:r>
+    </w:p>
+    <w:p>
+      <w:pPr>
+        <w:spacing w:after="60"/>
+      </w:pPr>
+      <w:r>
+        <w:rPr>
+          <w:b/>
+          <w:bCs/>
+          <w:color w:val="1FA6A2"/>
+          <w:sz w:val="22"/>
+          <w:szCs w:val="22"/>
+        </w:rPr>
+        <w:t xml:space="preserve">☐  </w:t>
+      </w:r>
+      <w:r>
+        <w:rPr>
+          <w:b/>
+          <w:bCs/>
+          <w:color w:val="12355B"/>
+          <w:sz w:val="20"/>
+          <w:szCs w:val="20"/>
+        </w:rPr>
+        <w:t xml:space="preserve">Prime number — </w:t>
+      </w:r>
+      <w:r>
+        <w:rPr>
+          <w:sz w:val="20"/>
+          <w:szCs w:val="20"/>
+        </w:rPr>
+        <w:t xml:space="preserve">A number bigger than 1 that you can only divide by 1 and itself.</w:t>
+      </w:r>
+      <w:r>
+        <w:rPr>
+          <w:i/>
+          <w:iCs/>
+          <w:color w:val="5F6F80"/>
+          <w:sz w:val="18"/>
+          <w:szCs w:val="18"/>
+        </w:rPr>
+        <w:br/>
+        <w:t xml:space="preserve">Número primo — Un número mayor que 1 que solo se puede dividir entre 1 y sí mismo.</w:t>
+      </w:r>
+    </w:p>
+    <w:p>
+      <w:pPr>
+        <w:spacing w:after="60"/>
+      </w:pPr>
+      <w:r>
+        <w:rPr>
+          <w:b/>
+          <w:bCs/>
+          <w:color w:val="1FA6A2"/>
+          <w:sz w:val="22"/>
+          <w:szCs w:val="22"/>
+        </w:rPr>
+        <w:t xml:space="preserve">☐  </w:t>
+      </w:r>
+      <w:r>
+        <w:rPr>
+          <w:b/>
+          <w:bCs/>
+          <w:color w:val="12355B"/>
+          <w:sz w:val="20"/>
+          <w:szCs w:val="20"/>
+        </w:rPr>
+        <w:t xml:space="preserve">Composite number — </w:t>
+      </w:r>
+      <w:r>
+        <w:rPr>
+          <w:sz w:val="20"/>
+          <w:szCs w:val="20"/>
+        </w:rPr>
+        <w:t xml:space="preserve">A number bigger than 1 that you can divide by more than just 1 and itself.</w:t>
+      </w:r>
+      <w:r>
+        <w:rPr>
+          <w:i/>
+          <w:iCs/>
+          <w:color w:val="5F6F80"/>
+          <w:sz w:val="18"/>
+          <w:szCs w:val="18"/>
+        </w:rPr>
+        <w:br/>
+        <w:t xml:space="preserve">Número compuesto — Un número mayor que 1 que se puede dividir entre más números, no solo 1 y sí mismo.</w:t>
+      </w:r>
+    </w:p>
+    <w:p>
+      <w:pPr>
+        <w:spacing w:after="60"/>
+      </w:pPr>
+      <w:r>
+        <w:rPr>
+          <w:b/>
+          <w:bCs/>
+          <w:color w:val="1FA6A2"/>
+          <w:sz w:val="22"/>
+          <w:szCs w:val="22"/>
+        </w:rPr>
+        <w:t xml:space="preserve">☐  </w:t>
+      </w:r>
+      <w:r>
+        <w:rPr>
+          <w:b/>
+          <w:bCs/>
+          <w:color w:val="12355B"/>
+          <w:sz w:val="20"/>
+          <w:szCs w:val="20"/>
+        </w:rPr>
+        <w:t xml:space="preserve">Prime factorization — </w:t>
+      </w:r>
+      <w:r>
+        <w:rPr>
+          <w:sz w:val="20"/>
+          <w:szCs w:val="20"/>
+        </w:rPr>
+        <w:t xml:space="preserve">Writing a number as prime numbers multiplied together.</w:t>
+      </w:r>
+      <w:r>
+        <w:rPr>
+          <w:i/>
+          <w:iCs/>
+          <w:color w:val="5F6F80"/>
+          <w:sz w:val="18"/>
+          <w:szCs w:val="18"/>
+        </w:rPr>
+        <w:br/>
+        <w:t xml:space="preserve">Factorización prima — Escribir un número como números primos multiplicados.</w:t>
+      </w:r>
+    </w:p>
+    <w:p>
+      <w:pPr>
+        <w:spacing w:after="60"/>
+      </w:pPr>
+      <w:r>
+        <w:rPr>
+          <w:b/>
+          <w:bCs/>
+          <w:color w:val="1FA6A2"/>
+          <w:sz w:val="22"/>
+          <w:szCs w:val="22"/>
+        </w:rPr>
+        <w:t xml:space="preserve">☐  </w:t>
+      </w:r>
+      <w:r>
+        <w:rPr>
+          <w:b/>
+          <w:bCs/>
+          <w:color w:val="12355B"/>
+          <w:sz w:val="20"/>
+          <w:szCs w:val="20"/>
+        </w:rPr>
+        <w:t xml:space="preserve">Factor tree — </w:t>
+      </w:r>
+      <w:r>
+        <w:rPr>
+          <w:sz w:val="20"/>
+          <w:szCs w:val="20"/>
+        </w:rPr>
+        <w:t xml:space="preserve">A picture that splits a number into its prime numbers, step by step.</w:t>
+      </w:r>
+      <w:r>
+        <w:rPr>
+          <w:i/>
+          <w:iCs/>
+          <w:color w:val="5F6F80"/>
+          <w:sz w:val="18"/>
+          <w:szCs w:val="18"/>
+        </w:rPr>
+        <w:br/>
+        <w:t xml:space="preserve">Árbol de factores — Un dibujo que separa un número en sus números primos, paso a paso.</w:t>
+      </w:r>
+    </w:p>
+    <w:p>
+      <w:pPr>
+        <w:spacing w:after="60"/>
+      </w:pPr>
+      <w:r>
+        <w:rPr>
+          <w:b/>
+          <w:bCs/>
+          <w:color w:val="1FA6A2"/>
+          <w:sz w:val="22"/>
+          <w:szCs w:val="22"/>
+        </w:rPr>
+        <w:t xml:space="preserve">☐  </w:t>
+      </w:r>
+      <w:r>
+        <w:rPr>
+          <w:b/>
+          <w:bCs/>
+          <w:color w:val="12355B"/>
+          <w:sz w:val="20"/>
+          <w:szCs w:val="20"/>
+        </w:rPr>
+        <w:t xml:space="preserve">Exponent — </w:t>
+      </w:r>
+      <w:r>
+        <w:rPr>
+          <w:sz w:val="20"/>
+          <w:szCs w:val="20"/>
+        </w:rPr>
+        <w:t xml:space="preserve">A small number that tells how many times to multiply a number by itself.</w:t>
+      </w:r>
+      <w:r>
+        <w:rPr>
+          <w:i/>
+          <w:iCs/>
+          <w:color w:val="5F6F80"/>
+          <w:sz w:val="18"/>
+          <w:szCs w:val="18"/>
+        </w:rPr>
+        <w:br/>
+        <w:t xml:space="preserve">Exponente — Un número pequeño que dice cuántas veces multiplicar un número por sí mismo.</w:t>
+      </w:r>
+    </w:p>
+    <w:tbl>
+      <w:tblPr>
+        <w:tblW w:type="pct" w:w="100%"/>
+        <w:tblBorders>
+          <w:top w:val="single" w:color="1FA6A2" w:sz="8"/>
+          <w:left w:val="single" w:color="1FA6A2" w:sz="8"/>
+          <w:bottom w:val="single" w:color="1FA6A2" w:sz="8"/>
+          <w:right w:val="single" w:color="1FA6A2" w:sz="8"/>
+          <w:insideH w:val="single" w:color="auto" w:sz="4"/>
+          <w:insideV w:val="single" w:color="auto" w:sz="4"/>
+        </w:tblBorders>
+      </w:tblPr>
+      <w:tblGrid>
+        <w:gridCol w:w="100"/>
+      </w:tblGrid>
+      <w:tr>
+        <w:tc>
+          <w:tcPr>
+            <w:shd w:fill="F7FFFD" w:color="auto" w:val="clear"/>
+            <w:tcMar>
+              <w:top w:type="dxa" w:w="120"/>
+              <w:left w:type="dxa" w:w="180"/>
+              <w:bottom w:type="dxa" w:w="120"/>
+              <w:right w:type="dxa" w:w="180"/>
+            </w:tcMar>
+          </w:tcPr>
+          <w:p>
+            <w:pPr>
+              <w:spacing w:after="50"/>
+            </w:pPr>
+            <w:r>
+              <w:rPr>
+                <w:b/>
+                <w:bCs/>
+                <w:color w:val="1FA6A2"/>
+                <w:sz w:val="20"/>
+                <w:szCs w:val="20"/>
+              </w:rPr>
+              <w:t xml:space="preserve">Say it first:  </w:t>
+            </w:r>
+            <w:r>
+              <w:rPr>
+                <w:sz w:val="20"/>
+                <w:szCs w:val="20"/>
+              </w:rPr>
+              <w:t xml:space="preserve">Say your idea to a partner or quietly to yourself before you write.</w:t>
+            </w:r>
+          </w:p>
+          <w:p>
+            <w:pPr>
+              <w:spacing w:after="60"/>
+            </w:pPr>
+            <w:r>
+              <w:rPr>
+                <w:color w:val="1A2733"/>
                 <w:sz w:val="21"/>
                 <w:szCs w:val="21"/>
               </w:rPr>
-              <w:t xml:space="preserve">The space station received 60 supply crates. Mission Control needs to break this quantity into its prime components so the sorting robots can distribute them into equally sized pods. Help the crew find the prime factorization of 60!</w:t>
+              <w:t xml:space="preserve">I broke 48 into ___ first because ___.</w:t>
+            </w:r>
+            <w:r>
+              <w:rPr>
+                <w:i/>
+                <w:iCs/>
+                <w:color w:val="5F6F80"/>
+                <w:sz w:val="19"/>
+                <w:szCs w:val="19"/>
+              </w:rPr>
+              <w:br/>
+              <w:t xml:space="preserve">Separé 48 en ___ primero porque ___.</w:t>
             </w:r>
           </w:p>
         </w:tc>
@@ -1334,81 +1684,6 @@
     </w:tbl>
     <w:p>
       <w:pPr>
-        <w:spacing w:after="80"/>
-      </w:pPr>
-      <w:r>
-        <w:t xml:space="preserve"/>
-      </w:r>
-    </w:p>
-    <w:p>
-      <w:pPr>
-        <w:spacing w:after="50" w:before="60"/>
-      </w:pPr>
-      <w:r>
-        <w:rPr>
-          <w:b/>
-          <w:bCs/>
-          <w:color w:val="12355B"/>
-          <w:sz w:val="21"/>
-          <w:szCs w:val="21"/>
-        </w:rPr>
-        <w:t xml:space="preserve">Think about:</w:t>
-      </w:r>
-    </w:p>
-    <w:p>
-      <w:pPr>
-        <w:spacing w:after="40"/>
-        <w:ind w:left="300"/>
-      </w:pPr>
-      <w:r>
-        <w:rPr>
-          <w:sz w:val="20"/>
-          <w:szCs w:val="20"/>
-        </w:rPr>
-        <w:t xml:space="preserve">•  What number are we breaking down into factors?</w:t>
-      </w:r>
-    </w:p>
-    <w:p>
-      <w:pPr>
-        <w:spacing w:after="40"/>
-        <w:ind w:left="300"/>
-      </w:pPr>
-      <w:r>
-        <w:rPr>
-          <w:sz w:val="20"/>
-          <w:szCs w:val="20"/>
-        </w:rPr>
-        <w:t xml:space="preserve">•  What's the difference between a factor and a prime factor?</w:t>
-      </w:r>
-    </w:p>
-    <w:p>
-      <w:pPr>
-        <w:spacing w:after="40"/>
-        <w:ind w:left="300"/>
-      </w:pPr>
-      <w:r>
-        <w:rPr>
-          <w:sz w:val="20"/>
-          <w:szCs w:val="20"/>
-        </w:rPr>
-        <w:t xml:space="preserve">•  How many different ways can we start breaking 60 apart?</w:t>
-      </w:r>
-    </w:p>
-    <w:p>
-      <w:pPr>
-        <w:spacing w:after="40"/>
-        <w:ind w:left="300"/>
-      </w:pPr>
-      <w:r>
-        <w:rPr>
-          <w:sz w:val="20"/>
-          <w:szCs w:val="20"/>
-        </w:rPr>
-        <w:t xml:space="preserve">•  Will we always get the same prime factors no matter how we start?</w:t>
-      </w:r>
-    </w:p>
-    <w:p>
-      <w:pPr>
         <w:pStyle w:val="Heading2"/>
         <w:spacing w:after="80" w:before="180"/>
       </w:pPr>
@@ -1420,370 +1695,17 @@
           <w:sz w:val="24"/>
           <w:szCs w:val="24"/>
         </w:rPr>
-        <w:t xml:space="preserve">Solved Example</w:t>
+        <w:t xml:space="preserve">3. Build Your Explanation</w:t>
       </w:r>
       <w:r>
         <w:rPr>
           <w:i/>
           <w:iCs/>
-          <w:color w:val="1FA6A2"/>
-          <w:sz w:val="19"/>
-          <w:szCs w:val="19"/>
-        </w:rPr>
-        <w:t xml:space="preserve">   I Do — watch each step</w:t>
-      </w:r>
-    </w:p>
-    <w:p>
-      <w:pPr>
-        <w:keepNext/>
-        <w:spacing w:after="40"/>
-      </w:pPr>
-      <w:r>
-        <w:rPr>
-          <w:b/>
-          <w:bCs/>
-          <w:color w:val="12355B"/>
-          <w:sz w:val="21"/>
-          <w:szCs w:val="21"/>
-        </w:rPr>
-        <w:t xml:space="preserve">Problem:  </w:t>
-      </w:r>
-      <w:r>
-        <w:rPr>
-          <w:sz w:val="21"/>
-          <w:szCs w:val="21"/>
-        </w:rPr>
-        <w:t xml:space="preserve">Which of the following is a prime number?</w:t>
-      </w:r>
-    </w:p>
-    <w:p>
-      <w:pPr>
-        <w:spacing w:after="30"/>
-        <w:ind w:left="420"/>
-      </w:pPr>
-      <w:r>
-        <w:rPr>
-          <w:sz w:val="20"/>
-          <w:szCs w:val="20"/>
-        </w:rPr>
-        <w:t xml:space="preserve">A)  17</w:t>
-      </w:r>
-    </w:p>
-    <w:p>
-      <w:pPr>
-        <w:spacing w:after="30"/>
-        <w:ind w:left="420"/>
-      </w:pPr>
-      <w:r>
-        <w:rPr>
-          <w:sz w:val="20"/>
-          <w:szCs w:val="20"/>
-        </w:rPr>
-        <w:t xml:space="preserve">B)  15</w:t>
-      </w:r>
-    </w:p>
-    <w:p>
-      <w:pPr>
-        <w:spacing w:after="30"/>
-        <w:ind w:left="420"/>
-      </w:pPr>
-      <w:r>
-        <w:rPr>
-          <w:sz w:val="20"/>
-          <w:szCs w:val="20"/>
-        </w:rPr>
-        <w:t xml:space="preserve">C)  21</w:t>
-      </w:r>
-    </w:p>
-    <w:p>
-      <w:pPr>
-        <w:spacing w:after="30"/>
-        <w:ind w:left="420"/>
-      </w:pPr>
-      <w:r>
-        <w:rPr>
-          <w:sz w:val="20"/>
-          <w:szCs w:val="20"/>
-        </w:rPr>
-        <w:t xml:space="preserve">D)  9</w:t>
-      </w:r>
-    </w:p>
-    <w:p>
-      <w:pPr>
-        <w:spacing w:after="20" w:before="50"/>
-      </w:pPr>
-      <w:r>
-        <w:rPr>
-          <w:b/>
-          <w:bCs/>
-          <w:color w:val="1FA6A2"/>
-          <w:sz w:val="21"/>
-          <w:szCs w:val="21"/>
-        </w:rPr>
-        <w:t xml:space="preserve">Step 1:  </w:t>
-      </w:r>
-      <w:r>
-        <w:rPr>
-          <w:sz w:val="21"/>
-          <w:szCs w:val="21"/>
-        </w:rPr>
-        <w:t xml:space="preserve">17 has exactly two factors: 1 and 17.</w:t>
-      </w:r>
-    </w:p>
-    <w:p>
-      <w:pPr>
-        <w:spacing w:after="20" w:before="50"/>
-      </w:pPr>
-      <w:r>
-        <w:rPr>
-          <w:b/>
-          <w:bCs/>
-          <w:color w:val="1FA6A2"/>
-          <w:sz w:val="21"/>
-          <w:szCs w:val="21"/>
-        </w:rPr>
-        <w:t xml:space="preserve">Step 2:  </w:t>
-      </w:r>
-      <w:r>
-        <w:rPr>
-          <w:sz w:val="21"/>
-          <w:szCs w:val="21"/>
-        </w:rPr>
-        <w:t xml:space="preserve">15 = 3 × 5, 21 = 3 × 7, and 9 = 3 × 3, so they are all composite.</w:t>
-      </w:r>
-    </w:p>
-    <w:p>
-      <w:pPr>
-        <w:spacing w:after="40" w:before="60"/>
-      </w:pPr>
-      <w:r>
-        <w:rPr>
-          <w:b/>
-          <w:bCs/>
-          <w:color w:val="12355B"/>
-          <w:sz w:val="21"/>
-          <w:szCs w:val="21"/>
-        </w:rPr>
-        <w:t xml:space="preserve">Answer:  </w:t>
-      </w:r>
-      <w:r>
-        <w:rPr>
-          <w:b/>
-          <w:bCs/>
-          <w:sz w:val="21"/>
-          <w:szCs w:val="21"/>
-        </w:rPr>
-        <w:t xml:space="preserve">A. 17</w:t>
-      </w:r>
-    </w:p>
-    <w:p>
-      <w:pPr>
-        <w:pStyle w:val="Heading1"/>
-        <w:pageBreakBefore/>
-        <w:pBdr>
-          <w:bottom w:val="single" w:color="1FA6A2" w:sz="14" w:space="6"/>
-        </w:pBdr>
-        <w:spacing w:after="140" w:before="0"/>
-      </w:pPr>
-      <w:r>
-        <w:rPr>
-          <w:b/>
-          <w:bCs/>
-          <w:color w:val="12355B"/>
-          <w:sz w:val="30"/>
-          <w:szCs w:val="30"/>
-        </w:rPr>
-        <w:t xml:space="preserve">Guided Practice</w:t>
-      </w:r>
-    </w:p>
-    <w:p>
-      <w:pPr>
-        <w:pStyle w:val="Heading2"/>
-        <w:spacing w:after="80" w:before="180"/>
-      </w:pPr>
-      <w:r>
-        <w:rPr>
-          <w:b/>
-          <w:bCs/>
-          <w:color w:val="12355B"/>
-          <w:sz w:val="24"/>
-          <w:szCs w:val="24"/>
-        </w:rPr>
-        <w:t xml:space="preserve">Solve Together</w:t>
-      </w:r>
-      <w:r>
-        <w:rPr>
-          <w:i/>
-          <w:iCs/>
-          <w:color w:val="6B4FA0"/>
-          <w:sz w:val="19"/>
-          <w:szCs w:val="19"/>
-        </w:rPr>
-        <w:t xml:space="preserve">   We Do — work with your class</w:t>
-      </w:r>
-    </w:p>
-    <w:p>
-      <w:pPr>
-        <w:keepNext/>
-        <w:spacing w:after="40" w:before="40"/>
-      </w:pPr>
-      <w:r>
-        <w:rPr>
-          <w:b/>
-          <w:bCs/>
-          <w:color w:val="12355B"/>
-          <w:sz w:val="21"/>
-          <w:szCs w:val="21"/>
-        </w:rPr>
-        <w:t xml:space="preserve">Problem:  </w:t>
-      </w:r>
-      <w:r>
-        <w:rPr>
-          <w:sz w:val="21"/>
-          <w:szCs w:val="21"/>
-        </w:rPr>
-        <w:t xml:space="preserve">What is the prime factorization of 30?</w:t>
-      </w:r>
-    </w:p>
-    <w:p>
-      <w:pPr>
-        <w:spacing w:after="30"/>
-        <w:ind w:left="420"/>
-      </w:pPr>
-      <w:r>
-        <w:rPr>
-          <w:sz w:val="20"/>
-          <w:szCs w:val="20"/>
-        </w:rPr>
-        <w:t xml:space="preserve">A)  2 × 3 × 5</w:t>
-      </w:r>
-    </w:p>
-    <w:p>
-      <w:pPr>
-        <w:spacing w:after="30"/>
-        <w:ind w:left="420"/>
-      </w:pPr>
-      <w:r>
-        <w:rPr>
-          <w:sz w:val="20"/>
-          <w:szCs w:val="20"/>
-        </w:rPr>
-        <w:t xml:space="preserve">B)  5 × 6</w:t>
-      </w:r>
-    </w:p>
-    <w:p>
-      <w:pPr>
-        <w:spacing w:after="30"/>
-        <w:ind w:left="420"/>
-      </w:pPr>
-      <w:r>
-        <w:rPr>
-          <w:sz w:val="20"/>
-          <w:szCs w:val="20"/>
-        </w:rPr>
-        <w:t xml:space="preserve">C)  2 × 15</w:t>
-      </w:r>
-    </w:p>
-    <w:p>
-      <w:pPr>
-        <w:spacing w:after="30"/>
-        <w:ind w:left="420"/>
-      </w:pPr>
-      <w:r>
-        <w:rPr>
-          <w:sz w:val="20"/>
-          <w:szCs w:val="20"/>
-        </w:rPr>
-        <w:t xml:space="preserve">D)  3 × 10</w:t>
-      </w:r>
-    </w:p>
-    <w:p>
-      <w:pPr>
-        <w:keepNext/>
-        <w:spacing w:after="0" w:before="50"/>
-      </w:pPr>
-      <w:r>
-        <w:rPr>
-          <w:b/>
-          <w:bCs/>
-          <w:color w:val="6B4FA0"/>
-          <w:sz w:val="21"/>
-          <w:szCs w:val="21"/>
-        </w:rPr>
-        <w:t xml:space="preserve">Step 1:</w:t>
-      </w:r>
-    </w:p>
-    <w:p>
-      <w:pPr>
-        <w:pBdr>
-          <w:bottom w:val="single" w:color="AFBECC" w:sz="6"/>
-        </w:pBdr>
-        <w:spacing w:after="30" w:before="150"/>
-      </w:pPr>
-      <w:r>
-        <w:t xml:space="preserve"/>
-      </w:r>
-    </w:p>
-    <w:p>
-      <w:pPr>
-        <w:keepNext/>
-        <w:spacing w:after="0" w:before="50"/>
-      </w:pPr>
-      <w:r>
-        <w:rPr>
-          <w:b/>
-          <w:bCs/>
-          <w:color w:val="6B4FA0"/>
-          <w:sz w:val="21"/>
-          <w:szCs w:val="21"/>
-        </w:rPr>
-        <w:t xml:space="preserve">Step 2:</w:t>
-      </w:r>
-    </w:p>
-    <w:p>
-      <w:pPr>
-        <w:pBdr>
-          <w:bottom w:val="single" w:color="AFBECC" w:sz="6"/>
-        </w:pBdr>
-        <w:spacing w:after="30" w:before="150"/>
-      </w:pPr>
-      <w:r>
-        <w:t xml:space="preserve"/>
-      </w:r>
-    </w:p>
-    <w:p>
-      <w:pPr>
-        <w:keepNext/>
-        <w:spacing w:after="0" w:before="60"/>
-      </w:pPr>
-      <w:r>
-        <w:rPr>
-          <w:b/>
-          <w:bCs/>
-          <w:color w:val="12355B"/>
-          <w:sz w:val="21"/>
-          <w:szCs w:val="21"/>
-        </w:rPr>
-        <w:t xml:space="preserve">Answer:</w:t>
-      </w:r>
-    </w:p>
-    <w:p>
-      <w:pPr>
-        <w:pBdr>
-          <w:bottom w:val="single" w:color="AFBECC" w:sz="6"/>
-        </w:pBdr>
-        <w:spacing w:after="30" w:before="150"/>
-      </w:pPr>
-      <w:r>
-        <w:t xml:space="preserve"/>
-      </w:r>
-    </w:p>
-    <w:p>
-      <w:pPr>
-        <w:spacing w:after="80"/>
-      </w:pPr>
-      <w:r>
-        <w:t xml:space="preserve"/>
+          <w:color w:val="B97A12"/>
+          <w:sz w:val="19"/>
+          <w:szCs w:val="19"/>
+        </w:rPr>
+        <w:t xml:space="preserve">   choose your support</w:t>
       </w:r>
     </w:p>
     <w:tbl>
@@ -1814,6 +1736,1380 @@
           </w:tcPr>
           <w:p>
             <w:pPr>
+              <w:spacing w:after="50"/>
+            </w:pPr>
+            <w:r>
+              <w:rPr>
+                <w:i/>
+                <w:iCs/>
+                <w:color w:val="5F6F80"/>
+                <w:sz w:val="19"/>
+                <w:szCs w:val="19"/>
+              </w:rPr>
+              <w:t xml:space="preserve">This model shows the parts of an explanation. It does not answer your writing question.</w:t>
+            </w:r>
+          </w:p>
+          <w:p>
+            <w:pPr>
+              <w:spacing w:after="80"/>
+            </w:pPr>
+            <w:r>
+              <w:rPr>
+                <w:b/>
+                <w:bCs/>
+                <w:color w:val="12355B"/>
+                <w:sz w:val="19"/>
+                <w:szCs w:val="19"/>
+              </w:rPr>
+              <w:t xml:space="preserve">Claim:  </w:t>
+            </w:r>
+            <w:r>
+              <w:rPr>
+                <w:sz w:val="19"/>
+                <w:szCs w:val="19"/>
+              </w:rPr>
+              <w:t xml:space="preserve">48 is composite because it has more than two factors.</w:t>
+            </w:r>
+          </w:p>
+          <w:p>
+            <w:pPr>
+              <w:spacing w:after="80"/>
+            </w:pPr>
+            <w:r>
+              <w:rPr>
+                <w:b/>
+                <w:bCs/>
+                <w:color w:val="12355B"/>
+                <w:sz w:val="19"/>
+                <w:szCs w:val="19"/>
+              </w:rPr>
+              <w:t xml:space="preserve">Evidence:  </w:t>
+            </w:r>
+            <w:r>
+              <w:rPr>
+                <w:sz w:val="19"/>
+                <w:szCs w:val="19"/>
+              </w:rPr>
+              <w:t xml:space="preserve">Students say 48 is composite because it has more than two factors (divisible by 2, 3, 4, 6, ...), so it can be broken into smaller groups.</w:t>
+            </w:r>
+          </w:p>
+          <w:p>
+            <w:pPr>
+              <w:spacing w:after="80"/>
+            </w:pPr>
+            <w:r>
+              <w:rPr>
+                <w:b/>
+                <w:bCs/>
+                <w:color w:val="12355B"/>
+                <w:sz w:val="19"/>
+                <w:szCs w:val="19"/>
+              </w:rPr>
+              <w:t xml:space="preserve">Reasoning:  </w:t>
+            </w:r>
+            <w:r>
+              <w:rPr>
+                <w:sz w:val="19"/>
+                <w:szCs w:val="19"/>
+              </w:rPr>
+              <w:t xml:space="preserve">This evidence connects the definition of prime factorization to the mathematical claim.</w:t>
+            </w:r>
+          </w:p>
+        </w:tc>
+      </w:tr>
+    </w:tbl>
+    <w:p>
+      <w:pPr>
+        <w:pStyle w:val="Heading2"/>
+        <w:spacing w:after="80" w:before="180"/>
+      </w:pPr>
+      <w:r>
+        <w:rPr>
+          <w:b/>
+          <w:bCs/>
+          <w:color w:val="12355B"/>
+          <w:sz w:val="24"/>
+          <w:szCs w:val="24"/>
+        </w:rPr>
+        <w:t xml:space="preserve">Start</w:t>
+      </w:r>
+      <w:r>
+        <w:rPr>
+          <w:i/>
+          <w:iCs/>
+          <w:color w:val="1FA6A2"/>
+          <w:sz w:val="19"/>
+          <w:szCs w:val="19"/>
+        </w:rPr>
+        <w:t xml:space="preserve">   Most language support</w:t>
+      </w:r>
+    </w:p>
+    <w:p>
+      <w:pPr>
+        <w:spacing w:after="60"/>
+      </w:pPr>
+      <w:r>
+        <w:rPr>
+          <w:color w:val="1A2733"/>
+          <w:sz w:val="21"/>
+          <w:szCs w:val="21"/>
+        </w:rPr>
+        <w:t xml:space="preserve">Complete the frames. Use the word bank.</w:t>
+      </w:r>
+      <w:r>
+        <w:rPr>
+          <w:i/>
+          <w:iCs/>
+          <w:color w:val="5F6F80"/>
+          <w:sz w:val="19"/>
+          <w:szCs w:val="19"/>
+        </w:rPr>
+        <w:br/>
+        <w:t xml:space="preserve">Completa las oraciones. Usa el banco de palabras.</w:t>
+      </w:r>
+    </w:p>
+    <w:p>
+      <w:pPr>
+        <w:spacing w:after="60"/>
+      </w:pPr>
+      <w:r>
+        <w:rPr>
+          <w:color w:val="1A2733"/>
+          <w:sz w:val="21"/>
+          <w:szCs w:val="21"/>
+        </w:rPr>
+        <w:t xml:space="preserve">I broke 48 into ___ first because ___.</w:t>
+      </w:r>
+      <w:r>
+        <w:rPr>
+          <w:i/>
+          <w:iCs/>
+          <w:color w:val="5F6F80"/>
+          <w:sz w:val="19"/>
+          <w:szCs w:val="19"/>
+        </w:rPr>
+        <w:br/>
+        <w:t xml:space="preserve">Separé 48 en ___ primero porque ___.</w:t>
+      </w:r>
+    </w:p>
+    <w:p>
+      <w:pPr>
+        <w:spacing w:after="60"/>
+      </w:pPr>
+      <w:r>
+        <w:rPr>
+          <w:color w:val="1A2733"/>
+          <w:sz w:val="21"/>
+          <w:szCs w:val="21"/>
+        </w:rPr>
+        <w:t xml:space="preserve">I knew I was finished when every factor was ___.</w:t>
+      </w:r>
+      <w:r>
+        <w:rPr>
+          <w:i/>
+          <w:iCs/>
+          <w:color w:val="5F6F80"/>
+          <w:sz w:val="19"/>
+          <w:szCs w:val="19"/>
+        </w:rPr>
+        <w:br/>
+        <w:t xml:space="preserve">Supe que terminé cuando cada factor era ___.</w:t>
+      </w:r>
+    </w:p>
+    <w:tbl>
+      <w:tblPr>
+        <w:tblW w:type="pct" w:w="100%"/>
+        <w:tblBorders>
+          <w:top w:val="single" w:color="C7D2DD" w:sz="6"/>
+          <w:left w:val="single" w:color="C7D2DD" w:sz="6"/>
+          <w:bottom w:val="single" w:color="C7D2DD" w:sz="6"/>
+          <w:right w:val="single" w:color="C7D2DD" w:sz="6"/>
+          <w:insideH w:val="single" w:color="auto" w:sz="4"/>
+          <w:insideV w:val="single" w:color="auto" w:sz="4"/>
+        </w:tblBorders>
+      </w:tblPr>
+      <w:tblGrid>
+        <w:gridCol w:w="100"/>
+      </w:tblGrid>
+      <w:tr>
+        <w:tc>
+          <w:tcPr>
+            <w:shd w:fill="FBF3E2" w:color="auto" w:val="clear"/>
+            <w:tcMar>
+              <w:top w:type="dxa" w:w="60"/>
+              <w:left w:type="dxa" w:w="120"/>
+              <w:bottom w:type="dxa" w:w="60"/>
+              <w:right w:type="dxa" w:w="120"/>
+            </w:tcMar>
+          </w:tcPr>
+          <w:p>
+            <w:pPr>
+              <w:spacing w:after="0" w:line="320"/>
+            </w:pPr>
+            <w:r>
+              <w:t xml:space="preserve"/>
+            </w:r>
+          </w:p>
+          <w:p>
+            <w:pPr>
+              <w:spacing w:after="0" w:line="320"/>
+            </w:pPr>
+            <w:r>
+              <w:t xml:space="preserve"/>
+            </w:r>
+          </w:p>
+          <w:p>
+            <w:pPr>
+              <w:spacing w:after="0" w:line="320"/>
+            </w:pPr>
+            <w:r>
+              <w:t xml:space="preserve"/>
+            </w:r>
+          </w:p>
+        </w:tc>
+      </w:tr>
+    </w:tbl>
+    <w:p>
+      <w:pPr>
+        <w:pStyle w:val="Heading2"/>
+        <w:spacing w:after="80" w:before="180"/>
+      </w:pPr>
+      <w:r>
+        <w:rPr>
+          <w:b/>
+          <w:bCs/>
+          <w:color w:val="12355B"/>
+          <w:sz w:val="24"/>
+          <w:szCs w:val="24"/>
+        </w:rPr>
+        <w:t xml:space="preserve">Build</w:t>
+      </w:r>
+      <w:r>
+        <w:rPr>
+          <w:i/>
+          <w:iCs/>
+          <w:color w:val="B97A12"/>
+          <w:sz w:val="19"/>
+          <w:szCs w:val="19"/>
+        </w:rPr>
+        <w:t xml:space="preserve">   Some language support</w:t>
+      </w:r>
+    </w:p>
+    <w:p>
+      <w:pPr>
+        <w:spacing w:after="60"/>
+      </w:pPr>
+      <w:r>
+        <w:rPr>
+          <w:color w:val="1A2733"/>
+          <w:sz w:val="21"/>
+          <w:szCs w:val="21"/>
+        </w:rPr>
+        <w:t xml:space="preserve">Write two connected sentences. Use because, so, or but.</w:t>
+      </w:r>
+      <w:r>
+        <w:rPr>
+          <w:i/>
+          <w:iCs/>
+          <w:color w:val="5F6F80"/>
+          <w:sz w:val="19"/>
+          <w:szCs w:val="19"/>
+        </w:rPr>
+        <w:br/>
+        <w:t xml:space="preserve">Escribe dos oraciones conectadas. Usa porque, entonces o pero.</w:t>
+      </w:r>
+    </w:p>
+    <w:p>
+      <w:pPr>
+        <w:spacing w:after="60"/>
+      </w:pPr>
+      <w:r>
+        <w:rPr>
+          <w:color w:val="1A2733"/>
+          <w:sz w:val="21"/>
+          <w:szCs w:val="21"/>
+        </w:rPr>
+        <w:t xml:space="preserve">My claim is ___.</w:t>
+      </w:r>
+      <w:r>
+        <w:rPr>
+          <w:i/>
+          <w:iCs/>
+          <w:color w:val="5F6F80"/>
+          <w:sz w:val="19"/>
+          <w:szCs w:val="19"/>
+        </w:rPr>
+        <w:br/>
+        <w:t xml:space="preserve">Mi afirmación es ___.</w:t>
+      </w:r>
+    </w:p>
+    <w:p>
+      <w:pPr>
+        <w:spacing w:after="60"/>
+      </w:pPr>
+      <w:r>
+        <w:rPr>
+          <w:color w:val="1A2733"/>
+          <w:sz w:val="21"/>
+          <w:szCs w:val="21"/>
+        </w:rPr>
+        <w:t xml:space="preserve">I know because ___.</w:t>
+      </w:r>
+      <w:r>
+        <w:rPr>
+          <w:i/>
+          <w:iCs/>
+          <w:color w:val="5F6F80"/>
+          <w:sz w:val="19"/>
+          <w:szCs w:val="19"/>
+        </w:rPr>
+        <w:br/>
+        <w:t xml:space="preserve">Lo sé porque ___.</w:t>
+      </w:r>
+    </w:p>
+    <w:p>
+      <w:pPr>
+        <w:spacing w:after="60"/>
+      </w:pPr>
+      <w:r>
+        <w:rPr>
+          <w:color w:val="1A2733"/>
+          <w:sz w:val="21"/>
+          <w:szCs w:val="21"/>
+        </w:rPr>
+        <w:t xml:space="preserve">So ___.</w:t>
+      </w:r>
+      <w:r>
+        <w:rPr>
+          <w:i/>
+          <w:iCs/>
+          <w:color w:val="5F6F80"/>
+          <w:sz w:val="19"/>
+          <w:szCs w:val="19"/>
+        </w:rPr>
+        <w:br/>
+        <w:t xml:space="preserve">Entonces ___.</w:t>
+      </w:r>
+    </w:p>
+    <w:tbl>
+      <w:tblPr>
+        <w:tblW w:type="pct" w:w="100%"/>
+        <w:tblBorders>
+          <w:top w:val="single" w:color="C7D2DD" w:sz="6"/>
+          <w:left w:val="single" w:color="C7D2DD" w:sz="6"/>
+          <w:bottom w:val="single" w:color="C7D2DD" w:sz="6"/>
+          <w:right w:val="single" w:color="C7D2DD" w:sz="6"/>
+          <w:insideH w:val="single" w:color="auto" w:sz="4"/>
+          <w:insideV w:val="single" w:color="auto" w:sz="4"/>
+        </w:tblBorders>
+      </w:tblPr>
+      <w:tblGrid>
+        <w:gridCol w:w="100"/>
+      </w:tblGrid>
+      <w:tr>
+        <w:tc>
+          <w:tcPr>
+            <w:shd w:fill="FBF3E2" w:color="auto" w:val="clear"/>
+            <w:tcMar>
+              <w:top w:type="dxa" w:w="60"/>
+              <w:left w:type="dxa" w:w="120"/>
+              <w:bottom w:type="dxa" w:w="60"/>
+              <w:right w:type="dxa" w:w="120"/>
+            </w:tcMar>
+          </w:tcPr>
+          <w:p>
+            <w:pPr>
+              <w:spacing w:after="0" w:line="320"/>
+            </w:pPr>
+            <w:r>
+              <w:t xml:space="preserve"/>
+            </w:r>
+          </w:p>
+          <w:p>
+            <w:pPr>
+              <w:spacing w:after="0" w:line="320"/>
+            </w:pPr>
+            <w:r>
+              <w:t xml:space="preserve"/>
+            </w:r>
+          </w:p>
+          <w:p>
+            <w:pPr>
+              <w:spacing w:after="0" w:line="320"/>
+            </w:pPr>
+            <w:r>
+              <w:t xml:space="preserve"/>
+            </w:r>
+          </w:p>
+        </w:tc>
+      </w:tr>
+    </w:tbl>
+    <w:p>
+      <w:pPr>
+        <w:pStyle w:val="Heading2"/>
+        <w:spacing w:after="80" w:before="180"/>
+      </w:pPr>
+      <w:r>
+        <w:rPr>
+          <w:b/>
+          <w:bCs/>
+          <w:color w:val="12355B"/>
+          <w:sz w:val="24"/>
+          <w:szCs w:val="24"/>
+        </w:rPr>
+        <w:t xml:space="preserve">Explain</w:t>
+      </w:r>
+      <w:r>
+        <w:rPr>
+          <w:i/>
+          <w:iCs/>
+          <w:color w:val="B97A12"/>
+          <w:sz w:val="19"/>
+          <w:szCs w:val="19"/>
+        </w:rPr>
+        <w:t xml:space="preserve">   Light language support</w:t>
+      </w:r>
+    </w:p>
+    <w:p>
+      <w:pPr>
+        <w:spacing w:after="60"/>
+      </w:pPr>
+      <w:r>
+        <w:rPr>
+          <w:color w:val="1A2733"/>
+          <w:sz w:val="21"/>
+          <w:szCs w:val="21"/>
+        </w:rPr>
+        <w:t xml:space="preserve">Write a claim, give math evidence, and explain your reasoning.</w:t>
+      </w:r>
+      <w:r>
+        <w:rPr>
+          <w:i/>
+          <w:iCs/>
+          <w:color w:val="5F6F80"/>
+          <w:sz w:val="19"/>
+          <w:szCs w:val="19"/>
+        </w:rPr>
+        <w:br/>
+        <w:t xml:space="preserve">Escribe una afirmación, da evidencia matemática y explica tu razonamiento.</w:t>
+      </w:r>
+    </w:p>
+    <w:p>
+      <w:pPr>
+        <w:spacing w:after="60"/>
+      </w:pPr>
+      <w:r>
+        <w:rPr>
+          <w:color w:val="1A2733"/>
+          <w:sz w:val="21"/>
+          <w:szCs w:val="21"/>
+        </w:rPr>
+        <w:t xml:space="preserve">My claim is ___.</w:t>
+      </w:r>
+      <w:r>
+        <w:rPr>
+          <w:i/>
+          <w:iCs/>
+          <w:color w:val="5F6F80"/>
+          <w:sz w:val="19"/>
+          <w:szCs w:val="19"/>
+        </w:rPr>
+        <w:br/>
+        <w:t xml:space="preserve">Mi afirmación es ___.</w:t>
+      </w:r>
+    </w:p>
+    <w:p>
+      <w:pPr>
+        <w:spacing w:after="60"/>
+      </w:pPr>
+      <w:r>
+        <w:rPr>
+          <w:color w:val="1A2733"/>
+          <w:sz w:val="21"/>
+          <w:szCs w:val="21"/>
+        </w:rPr>
+        <w:t xml:space="preserve">My math evidence is ___.</w:t>
+      </w:r>
+      <w:r>
+        <w:rPr>
+          <w:i/>
+          <w:iCs/>
+          <w:color w:val="5F6F80"/>
+          <w:sz w:val="19"/>
+          <w:szCs w:val="19"/>
+        </w:rPr>
+        <w:br/>
+        <w:t xml:space="preserve">Mi evidencia matemática es ___.</w:t>
+      </w:r>
+    </w:p>
+    <w:p>
+      <w:pPr>
+        <w:spacing w:after="60"/>
+      </w:pPr>
+      <w:r>
+        <w:rPr>
+          <w:color w:val="1A2733"/>
+          <w:sz w:val="21"/>
+          <w:szCs w:val="21"/>
+        </w:rPr>
+        <w:t xml:space="preserve">This proves ___ because ___.</w:t>
+      </w:r>
+      <w:r>
+        <w:rPr>
+          <w:i/>
+          <w:iCs/>
+          <w:color w:val="5F6F80"/>
+          <w:sz w:val="19"/>
+          <w:szCs w:val="19"/>
+        </w:rPr>
+        <w:br/>
+        <w:t xml:space="preserve">Esto demuestra ___ porque ___.</w:t>
+      </w:r>
+    </w:p>
+    <w:tbl>
+      <w:tblPr>
+        <w:tblW w:type="pct" w:w="100%"/>
+        <w:tblBorders>
+          <w:top w:val="single" w:color="C7D2DD" w:sz="6"/>
+          <w:left w:val="single" w:color="C7D2DD" w:sz="6"/>
+          <w:bottom w:val="single" w:color="C7D2DD" w:sz="6"/>
+          <w:right w:val="single" w:color="C7D2DD" w:sz="6"/>
+          <w:insideH w:val="single" w:color="auto" w:sz="4"/>
+          <w:insideV w:val="single" w:color="auto" w:sz="4"/>
+        </w:tblBorders>
+      </w:tblPr>
+      <w:tblGrid>
+        <w:gridCol w:w="100"/>
+      </w:tblGrid>
+      <w:tr>
+        <w:tc>
+          <w:tcPr>
+            <w:shd w:fill="FBF3E2" w:color="auto" w:val="clear"/>
+            <w:tcMar>
+              <w:top w:type="dxa" w:w="60"/>
+              <w:left w:type="dxa" w:w="120"/>
+              <w:bottom w:type="dxa" w:w="60"/>
+              <w:right w:type="dxa" w:w="120"/>
+            </w:tcMar>
+          </w:tcPr>
+          <w:p>
+            <w:pPr>
+              <w:spacing w:after="0" w:line="320"/>
+            </w:pPr>
+            <w:r>
+              <w:t xml:space="preserve"/>
+            </w:r>
+          </w:p>
+          <w:p>
+            <w:pPr>
+              <w:spacing w:after="0" w:line="320"/>
+            </w:pPr>
+            <w:r>
+              <w:t xml:space="preserve"/>
+            </w:r>
+          </w:p>
+          <w:p>
+            <w:pPr>
+              <w:spacing w:after="0" w:line="320"/>
+            </w:pPr>
+            <w:r>
+              <w:t xml:space="preserve"/>
+            </w:r>
+          </w:p>
+          <w:p>
+            <w:pPr>
+              <w:spacing w:after="0" w:line="320"/>
+            </w:pPr>
+            <w:r>
+              <w:t xml:space="preserve"/>
+            </w:r>
+          </w:p>
+          <w:p>
+            <w:pPr>
+              <w:spacing w:after="0" w:line="320"/>
+            </w:pPr>
+            <w:r>
+              <w:t xml:space="preserve"/>
+            </w:r>
+          </w:p>
+        </w:tc>
+      </w:tr>
+    </w:tbl>
+    <w:p>
+      <w:pPr>
+        <w:pStyle w:val="Heading2"/>
+        <w:spacing w:after="80" w:before="180"/>
+      </w:pPr>
+      <w:r>
+        <w:rPr>
+          <w:b/>
+          <w:bCs/>
+          <w:color w:val="12355B"/>
+          <w:sz w:val="24"/>
+          <w:szCs w:val="24"/>
+        </w:rPr>
+        <w:t xml:space="preserve">4. Check Your Explanation</w:t>
+      </w:r>
+      <w:r>
+        <w:rPr>
+          <w:i/>
+          <w:iCs/>
+          <w:color w:val="1FA6A2"/>
+          <w:sz w:val="19"/>
+          <w:szCs w:val="19"/>
+        </w:rPr>
+        <w:t xml:space="preserve">   five quick checks</w:t>
+      </w:r>
+    </w:p>
+    <w:p>
+      <w:pPr>
+        <w:spacing w:after="80"/>
+      </w:pPr>
+      <w:r>
+        <w:rPr>
+          <w:b/>
+          <w:bCs/>
+          <w:color w:val="1FA6A2"/>
+          <w:sz w:val="22"/>
+          <w:szCs w:val="22"/>
+        </w:rPr>
+        <w:t xml:space="preserve">☐  </w:t>
+      </w:r>
+      <w:r>
+        <w:rPr>
+          <w:sz w:val="20"/>
+          <w:szCs w:val="20"/>
+        </w:rPr>
+        <w:t xml:space="preserve">I answered the question.</w:t>
+      </w:r>
+      <w:r>
+        <w:rPr>
+          <w:i/>
+          <w:iCs/>
+          <w:color w:val="5F6F80"/>
+          <w:sz w:val="18"/>
+          <w:szCs w:val="18"/>
+        </w:rPr>
+        <w:br/>
+        <w:t xml:space="preserve">Respondí la pregunta.</w:t>
+      </w:r>
+    </w:p>
+    <w:p>
+      <w:pPr>
+        <w:spacing w:after="80"/>
+      </w:pPr>
+      <w:r>
+        <w:rPr>
+          <w:b/>
+          <w:bCs/>
+          <w:color w:val="1FA6A2"/>
+          <w:sz w:val="22"/>
+          <w:szCs w:val="22"/>
+        </w:rPr>
+        <w:t xml:space="preserve">☐  </w:t>
+      </w:r>
+      <w:r>
+        <w:rPr>
+          <w:sz w:val="20"/>
+          <w:szCs w:val="20"/>
+        </w:rPr>
+        <w:t xml:space="preserve">I used math evidence: numbers, an equation, a model, or a comparison.</w:t>
+      </w:r>
+      <w:r>
+        <w:rPr>
+          <w:i/>
+          <w:iCs/>
+          <w:color w:val="5F6F80"/>
+          <w:sz w:val="18"/>
+          <w:szCs w:val="18"/>
+        </w:rPr>
+        <w:br/>
+        <w:t xml:space="preserve">Usé evidencia matemática: números, una ecuación, un modelo o una comparación.</w:t>
+      </w:r>
+    </w:p>
+    <w:p>
+      <w:pPr>
+        <w:spacing w:after="80"/>
+      </w:pPr>
+      <w:r>
+        <w:rPr>
+          <w:b/>
+          <w:bCs/>
+          <w:color w:val="1FA6A2"/>
+          <w:sz w:val="22"/>
+          <w:szCs w:val="22"/>
+        </w:rPr>
+        <w:t xml:space="preserve">☐  </w:t>
+      </w:r>
+      <w:r>
+        <w:rPr>
+          <w:sz w:val="20"/>
+          <w:szCs w:val="20"/>
+        </w:rPr>
+        <w:t xml:space="preserve">I explained how the evidence proves my answer.</w:t>
+      </w:r>
+      <w:r>
+        <w:rPr>
+          <w:i/>
+          <w:iCs/>
+          <w:color w:val="5F6F80"/>
+          <w:sz w:val="18"/>
+          <w:szCs w:val="18"/>
+        </w:rPr>
+        <w:br/>
+        <w:t xml:space="preserve">Expliqué cómo la evidencia demuestra mi respuesta.</w:t>
+      </w:r>
+    </w:p>
+    <w:p>
+      <w:pPr>
+        <w:spacing w:after="80"/>
+      </w:pPr>
+      <w:r>
+        <w:rPr>
+          <w:b/>
+          <w:bCs/>
+          <w:color w:val="1FA6A2"/>
+          <w:sz w:val="22"/>
+          <w:szCs w:val="22"/>
+        </w:rPr>
+        <w:t xml:space="preserve">☐  </w:t>
+      </w:r>
+      <w:r>
+        <w:rPr>
+          <w:sz w:val="20"/>
+          <w:szCs w:val="20"/>
+        </w:rPr>
+        <w:t xml:space="preserve">I used at least two math words.</w:t>
+      </w:r>
+      <w:r>
+        <w:rPr>
+          <w:i/>
+          <w:iCs/>
+          <w:color w:val="5F6F80"/>
+          <w:sz w:val="18"/>
+          <w:szCs w:val="18"/>
+        </w:rPr>
+        <w:br/>
+        <w:t xml:space="preserve">Usé por lo menos dos palabras matemáticas.</w:t>
+      </w:r>
+    </w:p>
+    <w:p>
+      <w:pPr>
+        <w:spacing w:after="80"/>
+      </w:pPr>
+      <w:r>
+        <w:rPr>
+          <w:b/>
+          <w:bCs/>
+          <w:color w:val="1FA6A2"/>
+          <w:sz w:val="22"/>
+          <w:szCs w:val="22"/>
+        </w:rPr>
+        <w:t xml:space="preserve">☐  </w:t>
+      </w:r>
+      <w:r>
+        <w:rPr>
+          <w:sz w:val="20"/>
+          <w:szCs w:val="20"/>
+        </w:rPr>
+        <w:t xml:space="preserve">I reread complete sentences and punctuation.</w:t>
+      </w:r>
+      <w:r>
+        <w:rPr>
+          <w:i/>
+          <w:iCs/>
+          <w:color w:val="5F6F80"/>
+          <w:sz w:val="18"/>
+          <w:szCs w:val="18"/>
+        </w:rPr>
+        <w:br/>
+        <w:t xml:space="preserve">Volví a leer mis oraciones completas y la puntuación.</w:t>
+      </w:r>
+    </w:p>
+    <w:p>
+      <w:pPr>
+        <w:pStyle w:val="Heading1"/>
+        <w:pageBreakBefore/>
+        <w:pBdr>
+          <w:bottom w:val="single" w:color="1FA6A2" w:sz="14" w:space="6"/>
+        </w:pBdr>
+        <w:spacing w:after="140" w:before="0"/>
+      </w:pPr>
+      <w:r>
+        <w:rPr>
+          <w:b/>
+          <w:bCs/>
+          <w:color w:val="12355B"/>
+          <w:sz w:val="30"/>
+          <w:szCs w:val="30"/>
+        </w:rPr>
+        <w:t xml:space="preserve">Worked Example</w:t>
+      </w:r>
+    </w:p>
+    <w:p>
+      <w:pPr>
+        <w:pStyle w:val="Heading2"/>
+        <w:spacing w:after="80" w:before="180"/>
+      </w:pPr>
+      <w:r>
+        <w:rPr>
+          <w:b/>
+          <w:bCs/>
+          <w:color w:val="12355B"/>
+          <w:sz w:val="24"/>
+          <w:szCs w:val="24"/>
+        </w:rPr>
+        <w:t xml:space="preserve">Watch &amp; Read</w:t>
+      </w:r>
+      <w:r>
+        <w:rPr>
+          <w:i/>
+          <w:iCs/>
+          <w:color w:val="1FA6A2"/>
+          <w:sz w:val="19"/>
+          <w:szCs w:val="19"/>
+        </w:rPr>
+        <w:t xml:space="preserve">   I Do — follow along with your teacher</w:t>
+      </w:r>
+    </w:p>
+    <w:tbl>
+      <w:tblPr>
+        <w:tblW w:type="pct" w:w="100%"/>
+        <w:tblBorders>
+          <w:top w:val="single" w:color="1FA6A2" w:sz="8"/>
+          <w:left w:val="single" w:color="1FA6A2" w:sz="8"/>
+          <w:bottom w:val="single" w:color="1FA6A2" w:sz="8"/>
+          <w:right w:val="single" w:color="1FA6A2" w:sz="8"/>
+          <w:insideH w:val="single" w:color="auto" w:sz="4"/>
+          <w:insideV w:val="single" w:color="auto" w:sz="4"/>
+        </w:tblBorders>
+      </w:tblPr>
+      <w:tblGrid>
+        <w:gridCol w:w="100"/>
+      </w:tblGrid>
+      <w:tr>
+        <w:tc>
+          <w:tcPr>
+            <w:shd w:fill="E6F4F3" w:color="auto" w:val="clear"/>
+            <w:tcMar>
+              <w:top w:type="dxa" w:w="120"/>
+              <w:left w:type="dxa" w:w="180"/>
+              <w:bottom w:type="dxa" w:w="120"/>
+              <w:right w:type="dxa" w:w="180"/>
+            </w:tcMar>
+          </w:tcPr>
+          <w:p>
+            <w:pPr>
+              <w:spacing w:after="60"/>
+            </w:pPr>
+            <w:r>
+              <w:rPr>
+                <w:b/>
+                <w:bCs/>
+                <w:color w:val="12355B"/>
+                <w:sz w:val="22"/>
+                <w:szCs w:val="22"/>
+              </w:rPr>
+              <w:t xml:space="preserve">Space Station Cargo Breakdown</w:t>
+            </w:r>
+          </w:p>
+          <w:p>
+            <w:pPr>
+              <w:spacing w:after="0"/>
+            </w:pPr>
+            <w:r>
+              <w:rPr>
+                <w:sz w:val="21"/>
+                <w:szCs w:val="21"/>
+              </w:rPr>
+              <w:t xml:space="preserve">The space station received 60 supply crates. Mission Control needs to break this quantity into its prime components so the sorting robots can distribute them into equally sized pods. Help the crew find the prime factorization of 60!</w:t>
+            </w:r>
+          </w:p>
+        </w:tc>
+      </w:tr>
+    </w:tbl>
+    <w:p>
+      <w:pPr>
+        <w:spacing w:after="80"/>
+      </w:pPr>
+      <w:r>
+        <w:t xml:space="preserve"/>
+      </w:r>
+    </w:p>
+    <w:p>
+      <w:pPr>
+        <w:spacing w:after="50" w:before="60"/>
+      </w:pPr>
+      <w:r>
+        <w:rPr>
+          <w:b/>
+          <w:bCs/>
+          <w:color w:val="12355B"/>
+          <w:sz w:val="21"/>
+          <w:szCs w:val="21"/>
+        </w:rPr>
+        <w:t xml:space="preserve">Think about:</w:t>
+      </w:r>
+    </w:p>
+    <w:p>
+      <w:pPr>
+        <w:spacing w:after="40"/>
+        <w:ind w:left="300"/>
+      </w:pPr>
+      <w:r>
+        <w:rPr>
+          <w:sz w:val="20"/>
+          <w:szCs w:val="20"/>
+        </w:rPr>
+        <w:t xml:space="preserve">•  What number are we breaking down into factors?</w:t>
+      </w:r>
+    </w:p>
+    <w:p>
+      <w:pPr>
+        <w:spacing w:after="40"/>
+        <w:ind w:left="300"/>
+      </w:pPr>
+      <w:r>
+        <w:rPr>
+          <w:sz w:val="20"/>
+          <w:szCs w:val="20"/>
+        </w:rPr>
+        <w:t xml:space="preserve">•  What's the difference between a factor and a prime factor?</w:t>
+      </w:r>
+    </w:p>
+    <w:p>
+      <w:pPr>
+        <w:spacing w:after="40"/>
+        <w:ind w:left="300"/>
+      </w:pPr>
+      <w:r>
+        <w:rPr>
+          <w:sz w:val="20"/>
+          <w:szCs w:val="20"/>
+        </w:rPr>
+        <w:t xml:space="preserve">•  How many different ways can we start breaking 60 apart?</w:t>
+      </w:r>
+    </w:p>
+    <w:p>
+      <w:pPr>
+        <w:spacing w:after="40"/>
+        <w:ind w:left="300"/>
+      </w:pPr>
+      <w:r>
+        <w:rPr>
+          <w:sz w:val="20"/>
+          <w:szCs w:val="20"/>
+        </w:rPr>
+        <w:t xml:space="preserve">•  Will we always get the same prime factors no matter how we start?</w:t>
+      </w:r>
+    </w:p>
+    <w:p>
+      <w:pPr>
+        <w:pStyle w:val="Heading2"/>
+        <w:spacing w:after="80" w:before="180"/>
+      </w:pPr>
+      <w:r>
+        <w:rPr>
+          <w:b/>
+          <w:bCs/>
+          <w:color w:val="12355B"/>
+          <w:sz w:val="24"/>
+          <w:szCs w:val="24"/>
+        </w:rPr>
+        <w:t xml:space="preserve">Solved Example</w:t>
+      </w:r>
+      <w:r>
+        <w:rPr>
+          <w:i/>
+          <w:iCs/>
+          <w:color w:val="1FA6A2"/>
+          <w:sz w:val="19"/>
+          <w:szCs w:val="19"/>
+        </w:rPr>
+        <w:t xml:space="preserve">   I Do — watch each step</w:t>
+      </w:r>
+    </w:p>
+    <w:p>
+      <w:pPr>
+        <w:keepNext/>
+        <w:spacing w:after="40"/>
+      </w:pPr>
+      <w:r>
+        <w:rPr>
+          <w:b/>
+          <w:bCs/>
+          <w:color w:val="12355B"/>
+          <w:sz w:val="21"/>
+          <w:szCs w:val="21"/>
+        </w:rPr>
+        <w:t xml:space="preserve">Problem:  </w:t>
+      </w:r>
+      <w:r>
+        <w:rPr>
+          <w:sz w:val="21"/>
+          <w:szCs w:val="21"/>
+        </w:rPr>
+        <w:t xml:space="preserve">Which of the following is a prime number?</w:t>
+      </w:r>
+    </w:p>
+    <w:p>
+      <w:pPr>
+        <w:spacing w:after="30"/>
+        <w:ind w:left="420"/>
+      </w:pPr>
+      <w:r>
+        <w:rPr>
+          <w:sz w:val="20"/>
+          <w:szCs w:val="20"/>
+        </w:rPr>
+        <w:t xml:space="preserve">A)  17</w:t>
+      </w:r>
+    </w:p>
+    <w:p>
+      <w:pPr>
+        <w:spacing w:after="30"/>
+        <w:ind w:left="420"/>
+      </w:pPr>
+      <w:r>
+        <w:rPr>
+          <w:sz w:val="20"/>
+          <w:szCs w:val="20"/>
+        </w:rPr>
+        <w:t xml:space="preserve">B)  15</w:t>
+      </w:r>
+    </w:p>
+    <w:p>
+      <w:pPr>
+        <w:spacing w:after="30"/>
+        <w:ind w:left="420"/>
+      </w:pPr>
+      <w:r>
+        <w:rPr>
+          <w:sz w:val="20"/>
+          <w:szCs w:val="20"/>
+        </w:rPr>
+        <w:t xml:space="preserve">C)  21</w:t>
+      </w:r>
+    </w:p>
+    <w:p>
+      <w:pPr>
+        <w:spacing w:after="30"/>
+        <w:ind w:left="420"/>
+      </w:pPr>
+      <w:r>
+        <w:rPr>
+          <w:sz w:val="20"/>
+          <w:szCs w:val="20"/>
+        </w:rPr>
+        <w:t xml:space="preserve">D)  9</w:t>
+      </w:r>
+    </w:p>
+    <w:p>
+      <w:pPr>
+        <w:spacing w:after="20" w:before="50"/>
+      </w:pPr>
+      <w:r>
+        <w:rPr>
+          <w:b/>
+          <w:bCs/>
+          <w:color w:val="1FA6A2"/>
+          <w:sz w:val="21"/>
+          <w:szCs w:val="21"/>
+        </w:rPr>
+        <w:t xml:space="preserve">Step 1:  </w:t>
+      </w:r>
+      <w:r>
+        <w:rPr>
+          <w:sz w:val="21"/>
+          <w:szCs w:val="21"/>
+        </w:rPr>
+        <w:t xml:space="preserve">17 has exactly two factors: 1 and 17.</w:t>
+      </w:r>
+    </w:p>
+    <w:p>
+      <w:pPr>
+        <w:spacing w:after="20" w:before="50"/>
+      </w:pPr>
+      <w:r>
+        <w:rPr>
+          <w:b/>
+          <w:bCs/>
+          <w:color w:val="1FA6A2"/>
+          <w:sz w:val="21"/>
+          <w:szCs w:val="21"/>
+        </w:rPr>
+        <w:t xml:space="preserve">Step 2:  </w:t>
+      </w:r>
+      <w:r>
+        <w:rPr>
+          <w:sz w:val="21"/>
+          <w:szCs w:val="21"/>
+        </w:rPr>
+        <w:t xml:space="preserve">15 = 3 × 5, 21 = 3 × 7, and 9 = 3 × 3, so they are all composite.</w:t>
+      </w:r>
+    </w:p>
+    <w:p>
+      <w:pPr>
+        <w:spacing w:after="40" w:before="60"/>
+      </w:pPr>
+      <w:r>
+        <w:rPr>
+          <w:b/>
+          <w:bCs/>
+          <w:color w:val="12355B"/>
+          <w:sz w:val="21"/>
+          <w:szCs w:val="21"/>
+        </w:rPr>
+        <w:t xml:space="preserve">Answer:  </w:t>
+      </w:r>
+      <w:r>
+        <w:rPr>
+          <w:b/>
+          <w:bCs/>
+          <w:sz w:val="21"/>
+          <w:szCs w:val="21"/>
+        </w:rPr>
+        <w:t xml:space="preserve">A. 17</w:t>
+      </w:r>
+    </w:p>
+    <w:p>
+      <w:pPr>
+        <w:pStyle w:val="Heading1"/>
+        <w:pageBreakBefore/>
+        <w:pBdr>
+          <w:bottom w:val="single" w:color="1FA6A2" w:sz="14" w:space="6"/>
+        </w:pBdr>
+        <w:spacing w:after="140" w:before="0"/>
+      </w:pPr>
+      <w:r>
+        <w:rPr>
+          <w:b/>
+          <w:bCs/>
+          <w:color w:val="12355B"/>
+          <w:sz w:val="30"/>
+          <w:szCs w:val="30"/>
+        </w:rPr>
+        <w:t xml:space="preserve">Guided Practice</w:t>
+      </w:r>
+    </w:p>
+    <w:p>
+      <w:pPr>
+        <w:pStyle w:val="Heading2"/>
+        <w:spacing w:after="80" w:before="180"/>
+      </w:pPr>
+      <w:r>
+        <w:rPr>
+          <w:b/>
+          <w:bCs/>
+          <w:color w:val="12355B"/>
+          <w:sz w:val="24"/>
+          <w:szCs w:val="24"/>
+        </w:rPr>
+        <w:t xml:space="preserve">Solve Together</w:t>
+      </w:r>
+      <w:r>
+        <w:rPr>
+          <w:i/>
+          <w:iCs/>
+          <w:color w:val="6B4FA0"/>
+          <w:sz w:val="19"/>
+          <w:szCs w:val="19"/>
+        </w:rPr>
+        <w:t xml:space="preserve">   We Do — work with your class</w:t>
+      </w:r>
+    </w:p>
+    <w:p>
+      <w:pPr>
+        <w:keepNext/>
+        <w:spacing w:after="40" w:before="40"/>
+      </w:pPr>
+      <w:r>
+        <w:rPr>
+          <w:b/>
+          <w:bCs/>
+          <w:color w:val="12355B"/>
+          <w:sz w:val="21"/>
+          <w:szCs w:val="21"/>
+        </w:rPr>
+        <w:t xml:space="preserve">Problem:  </w:t>
+      </w:r>
+      <w:r>
+        <w:rPr>
+          <w:sz w:val="21"/>
+          <w:szCs w:val="21"/>
+        </w:rPr>
+        <w:t xml:space="preserve">What is the prime factorization of 30?</w:t>
+      </w:r>
+    </w:p>
+    <w:p>
+      <w:pPr>
+        <w:spacing w:after="30"/>
+        <w:ind w:left="420"/>
+      </w:pPr>
+      <w:r>
+        <w:rPr>
+          <w:sz w:val="20"/>
+          <w:szCs w:val="20"/>
+        </w:rPr>
+        <w:t xml:space="preserve">A)  2 × 3 × 5</w:t>
+      </w:r>
+    </w:p>
+    <w:p>
+      <w:pPr>
+        <w:spacing w:after="30"/>
+        <w:ind w:left="420"/>
+      </w:pPr>
+      <w:r>
+        <w:rPr>
+          <w:sz w:val="20"/>
+          <w:szCs w:val="20"/>
+        </w:rPr>
+        <w:t xml:space="preserve">B)  5 × 6</w:t>
+      </w:r>
+    </w:p>
+    <w:p>
+      <w:pPr>
+        <w:spacing w:after="30"/>
+        <w:ind w:left="420"/>
+      </w:pPr>
+      <w:r>
+        <w:rPr>
+          <w:sz w:val="20"/>
+          <w:szCs w:val="20"/>
+        </w:rPr>
+        <w:t xml:space="preserve">C)  2 × 15</w:t>
+      </w:r>
+    </w:p>
+    <w:p>
+      <w:pPr>
+        <w:spacing w:after="30"/>
+        <w:ind w:left="420"/>
+      </w:pPr>
+      <w:r>
+        <w:rPr>
+          <w:sz w:val="20"/>
+          <w:szCs w:val="20"/>
+        </w:rPr>
+        <w:t xml:space="preserve">D)  3 × 10</w:t>
+      </w:r>
+    </w:p>
+    <w:p>
+      <w:pPr>
+        <w:keepNext/>
+        <w:spacing w:after="0" w:before="50"/>
+      </w:pPr>
+      <w:r>
+        <w:rPr>
+          <w:b/>
+          <w:bCs/>
+          <w:color w:val="6B4FA0"/>
+          <w:sz w:val="21"/>
+          <w:szCs w:val="21"/>
+        </w:rPr>
+        <w:t xml:space="preserve">Step 1:</w:t>
+      </w:r>
+    </w:p>
+    <w:p>
+      <w:pPr>
+        <w:pBdr>
+          <w:bottom w:val="single" w:color="AFBECC" w:sz="6"/>
+        </w:pBdr>
+        <w:spacing w:after="30" w:before="150"/>
+      </w:pPr>
+      <w:r>
+        <w:t xml:space="preserve"/>
+      </w:r>
+    </w:p>
+    <w:p>
+      <w:pPr>
+        <w:keepNext/>
+        <w:spacing w:after="0" w:before="50"/>
+      </w:pPr>
+      <w:r>
+        <w:rPr>
+          <w:b/>
+          <w:bCs/>
+          <w:color w:val="6B4FA0"/>
+          <w:sz w:val="21"/>
+          <w:szCs w:val="21"/>
+        </w:rPr>
+        <w:t xml:space="preserve">Step 2:</w:t>
+      </w:r>
+    </w:p>
+    <w:p>
+      <w:pPr>
+        <w:pBdr>
+          <w:bottom w:val="single" w:color="AFBECC" w:sz="6"/>
+        </w:pBdr>
+        <w:spacing w:after="30" w:before="150"/>
+      </w:pPr>
+      <w:r>
+        <w:t xml:space="preserve"/>
+      </w:r>
+    </w:p>
+    <w:p>
+      <w:pPr>
+        <w:keepNext/>
+        <w:spacing w:after="0" w:before="60"/>
+      </w:pPr>
+      <w:r>
+        <w:rPr>
+          <w:b/>
+          <w:bCs/>
+          <w:color w:val="12355B"/>
+          <w:sz w:val="21"/>
+          <w:szCs w:val="21"/>
+        </w:rPr>
+        <w:t xml:space="preserve">Answer:</w:t>
+      </w:r>
+    </w:p>
+    <w:p>
+      <w:pPr>
+        <w:pBdr>
+          <w:bottom w:val="single" w:color="AFBECC" w:sz="6"/>
+        </w:pBdr>
+        <w:spacing w:after="30" w:before="150"/>
+      </w:pPr>
+      <w:r>
+        <w:t xml:space="preserve"/>
+      </w:r>
+    </w:p>
+    <w:p>
+      <w:pPr>
+        <w:spacing w:after="80"/>
+      </w:pPr>
+      <w:r>
+        <w:t xml:space="preserve"/>
+      </w:r>
+    </w:p>
+    <w:tbl>
+      <w:tblPr>
+        <w:tblW w:type="pct" w:w="100%"/>
+        <w:tblBorders>
+          <w:top w:val="single" w:color="BBD0DE" w:sz="8"/>
+          <w:left w:val="single" w:color="BBD0DE" w:sz="8"/>
+          <w:bottom w:val="single" w:color="BBD0DE" w:sz="8"/>
+          <w:right w:val="single" w:color="BBD0DE" w:sz="8"/>
+          <w:insideH w:val="single" w:color="auto" w:sz="4"/>
+          <w:insideV w:val="single" w:color="auto" w:sz="4"/>
+        </w:tblBorders>
+      </w:tblPr>
+      <w:tblGrid>
+        <w:gridCol w:w="100"/>
+      </w:tblGrid>
+      <w:tr>
+        <w:tc>
+          <w:tcPr>
+            <w:shd w:fill="EEF4F8" w:color="auto" w:val="clear"/>
+            <w:tcMar>
+              <w:top w:type="dxa" w:w="120"/>
+              <w:left w:type="dxa" w:w="180"/>
+              <w:bottom w:type="dxa" w:w="120"/>
+              <w:right w:type="dxa" w:w="180"/>
+            </w:tcMar>
+          </w:tcPr>
+          <w:p>
+            <w:pPr>
               <w:spacing w:after="60"/>
             </w:pPr>
             <w:r>
@@ -3418,6 +4714,97 @@
           <w:szCs w:val="19"/>
         </w:rPr>
         <w:t xml:space="preserve">  — 40 = 2 × 20 = 2 × 2 × 10 = 2 × 2 × 2 × 5. All factors (2, 2, 2, 5) are prime.</w:t>
+      </w:r>
+    </w:p>
+    <w:p>
+      <w:pPr>
+        <w:pStyle w:val="Heading2"/>
+        <w:spacing w:after="80" w:before="180"/>
+      </w:pPr>
+      <w:r>
+        <w:rPr>
+          <w:b/>
+          <w:bCs/>
+          <w:color w:val="12355B"/>
+          <w:sz w:val="24"/>
+          <w:szCs w:val="24"/>
+        </w:rPr>
+        <w:t xml:space="preserve">Math Writing Criteria</w:t>
+      </w:r>
+    </w:p>
+    <w:p>
+      <w:pPr>
+        <w:spacing w:after="100"/>
+      </w:pPr>
+      <w:r>
+        <w:rPr>
+          <w:i/>
+          <w:iCs/>
+          <w:color w:val="5F6F80"/>
+          <w:sz w:val="19"/>
+          <w:szCs w:val="19"/>
+        </w:rPr>
+        <w:t xml:space="preserve">The support level changes the amount of language scaffolding, not the mathematical expectation.</w:t>
+      </w:r>
+    </w:p>
+    <w:p>
+      <w:pPr>
+        <w:spacing w:after="80"/>
+      </w:pPr>
+      <w:r>
+        <w:rPr>
+          <w:sz w:val="20"/>
+          <w:szCs w:val="20"/>
+        </w:rPr>
+        <w:t xml:space="preserve">☐  I answered the question.</w:t>
+      </w:r>
+    </w:p>
+    <w:p>
+      <w:pPr>
+        <w:spacing w:after="80"/>
+      </w:pPr>
+      <w:r>
+        <w:rPr>
+          <w:sz w:val="20"/>
+          <w:szCs w:val="20"/>
+        </w:rPr>
+        <w:t xml:space="preserve">☐  I used math evidence: numbers, an equation, a model, or a comparison.</w:t>
+      </w:r>
+    </w:p>
+    <w:p>
+      <w:pPr>
+        <w:spacing w:after="80"/>
+      </w:pPr>
+      <w:r>
+        <w:rPr>
+          <w:sz w:val="20"/>
+          <w:szCs w:val="20"/>
+        </w:rPr>
+        <w:t xml:space="preserve">☐  I explained how the evidence proves my answer.</w:t>
+      </w:r>
+    </w:p>
+    <w:p>
+      <w:pPr>
+        <w:spacing w:after="80"/>
+      </w:pPr>
+      <w:r>
+        <w:rPr>
+          <w:sz w:val="20"/>
+          <w:szCs w:val="20"/>
+        </w:rPr>
+        <w:t xml:space="preserve">☐  I used at least two math words.</w:t>
+      </w:r>
+    </w:p>
+    <w:p>
+      <w:pPr>
+        <w:spacing w:after="80"/>
+      </w:pPr>
+      <w:r>
+        <w:rPr>
+          <w:sz w:val="20"/>
+          <w:szCs w:val="20"/>
+        </w:rPr>
+        <w:t xml:space="preserve">☐  I reread complete sentences and punctuation.</w:t>
       </w:r>
     </w:p>
     <w:sectPr>

</xml_diff>